<commit_message>
Opravy překlepů a smazané vyřešené komentáře
Překlepy (83 oprav ve 41 extraktech): pravopis (autonimní, evroppský,
hormonizovaná, poveleno, souboyy, tygu, zasílaných práv …), anglické
termíny (Equippment, symantics, Corformance, Lenght …), slova rozdělená
mezerou z kopírování z PDF (24534-4, -5, 24535), mezery u interpunkce,
zástupný text „xxxxxx“ v hlavičce 24099 a zapomenutá poznámka „Uvést
vzorové xml“ v 24530-4. Seznam: _prace/kontrola/opravy.tsv mimo repozitář.

Komentáře: smazané v 9 Wordech, kde byly vyřešené nebo šlo o evidenci
publikace (14823-1, 21219-16, -18, -22, -23, -24, 16410-2, 17444-2,
22726-1). V 16403-2 zůstaly – výtky jsou zapracované jen ve verzi na webu.

Co-Authored-By: Claude Opus 5.5 <noreply@anthropic.com>
Claude-Session: https://claude.ai/code/session_013XsG4Ss77xGbwrRyA4pUBh
</commit_message>
<xml_diff>
--- a/extrakty/doc/TC278WG12/extract_14816_(2008).docx
+++ b/extrakty/doc/TC278WG12/extract_14816_(2008).docx
@@ -189,7 +189,7 @@
       </w:pPr>
       <w:r>
         <w:rPr/>
-        <w:t>Tato norma je součástí norem zaměřených na automatickou identifikaci vozidla, nákladu či položky zařízení pro účely telematických aplikací. Konkrétní telematické aplikace jsou sice z normy vyjmuty, ale jako příklad můžeme uvést systém elektronického výběru mýtného. V tomto systému jsou vozy vybaveny elektronickým zařízením obsahujícím údaje sloužící k jejich identifikaci.Jaké jsou tyto údaje, jakým způsobem se přidělují či jak jsou strukturovány určuje právě tato norma. Norma se nezabývá fyzickými aspekty jako je např. rozhraní, není závislá ani na frekvenci či radiovém rozhraní.</w:t>
+        <w:t xml:space="preserve">Tato norma je součástí norem zaměřených na automatickou identifikaci vozidla, nákladu či položky zařízení pro účely telematických aplikací. Konkrétní telematické aplikace jsou sice z normy vyjmuty, ale jako příklad můžeme uvést systém elektronického výběru mýtného. V tomto systému jsou vozy vybaveny elektronickým zařízením obsahujícím údaje sloužící k jejich identifikaci. Jaké jsou tyto údaje, jakým způsobem se přidělují či jak jsou strukturovány určuje právě tato norma. Norma se nezabývá fyzickými aspekty jako je např. rozhraní, není závislá ani na frekvenci či radiovém rozhraní.</w:t>
       </w:r>
     </w:p>
     <w:p>
@@ -546,20 +546,20 @@
           <w:i/>
           <w:lang w:bidi="zxx"/>
         </w:rPr>
-        <w:t>(issuer register)</w:t>
-      </w:r>
-      <w:r>
-        <w:rPr>
-          <w:b/>
-          <w:lang w:bidi="zxx"/>
-        </w:rPr>
-        <w:t xml:space="preserve"> (</w:t>
-      </w:r>
-      <w:r>
-        <w:rPr>
-          <w:lang w:bidi="zxx"/>
-        </w:rPr>
-        <w:t xml:space="preserve">NRA/I musí udržovat registr Vydavatelů a struktur na národní úrovni. Registr vydavatelů nesmí obsahovat žádné osobní informace. </w:t>
+        <w:t xml:space="preserve">(issuer register) NRA/I musí</w:t>
+      </w:r>
+      <w:r>
+        <w:rPr>
+          <w:b/>
+          <w:lang w:bidi="zxx"/>
+        </w:rPr>
+        <w:t xml:space="preserve"/>
+      </w:r>
+      <w:r>
+        <w:rPr>
+          <w:lang w:bidi="zxx"/>
+        </w:rPr>
+        <w:t xml:space="preserve"> udržovat registr Vydavatelů a struktur na národní úrovni. Registr vydavatelů nesmí obsahovat žádné osobní informace. </w:t>
       </w:r>
     </w:p>
     <w:p>

</xml_diff>